<commit_message>
Update meeting minutes for 9/20
</commit_message>
<xml_diff>
--- a/docs/廣大中學智慧管理平台紀要-2026-09-20.docx
+++ b/docs/廣大中學智慧管理平台紀要-2026-09-20.docx
@@ -619,7 +619,7 @@
           <w:szCs w:val="28"/>
           <w:lang w:eastAsia="zh-TW"/>
         </w:rPr>
-        <w:t>期在現有系統之外，建立師評、審批與採購資產系統。系統部署於 CTM 服務器，教師以企業微信帳號登入</w:t>
+        <w:t>期在現有系統之外，建立師評、審批與採購資產系統。系統部署於 CTM 服務器，教師</w:t>
       </w:r>
       <w:r>
         <w:rPr>
@@ -628,25 +628,61 @@
           <w:szCs w:val="28"/>
           <w:lang w:eastAsia="zh-TW"/>
         </w:rPr>
-        <w:t>，後續可</w:t>
-      </w:r>
-      <w:r>
-        <w:rPr>
-          <w:rFonts w:ascii="FangSong" w:eastAsia="FangSong" w:hAnsi="FangSong"/>
-          <w:sz w:val="28"/>
-          <w:szCs w:val="28"/>
-          <w:lang w:eastAsia="zh-TW"/>
-        </w:rPr>
-        <w:t>掛接</w:t>
-      </w:r>
-      <w:r>
-        <w:rPr>
-          <w:rFonts w:ascii="FangSong" w:eastAsia="FangSong" w:hAnsi="FangSong"/>
-          <w:sz w:val="28"/>
-          <w:szCs w:val="28"/>
-          <w:lang w:eastAsia="zh-TW"/>
-        </w:rPr>
-        <w:t>企業微信</w:t>
+        <w:t>可用google/</w:t>
+      </w:r>
+      <w:r>
+        <w:rPr>
+          <w:rFonts w:ascii="FangSong" w:eastAsia="FangSong" w:hAnsi="FangSong" w:hint="eastAsia"/>
+          <w:sz w:val="28"/>
+          <w:szCs w:val="28"/>
+          <w:lang w:eastAsia="zh-TW"/>
+        </w:rPr>
+        <w:t>微</w:t>
+      </w:r>
+      <w:r>
+        <w:rPr>
+          <w:rFonts w:ascii="FangSong" w:eastAsia="FangSong" w:hAnsi="FangSong"/>
+          <w:sz w:val="28"/>
+          <w:szCs w:val="28"/>
+          <w:lang w:eastAsia="zh-TW"/>
+        </w:rPr>
+        <w:t>信帳號登入</w:t>
+      </w:r>
+      <w:r>
+        <w:rPr>
+          <w:rFonts w:ascii="FangSong" w:eastAsia="FangSong" w:hAnsi="FangSong" w:hint="eastAsia"/>
+          <w:sz w:val="28"/>
+          <w:szCs w:val="28"/>
+          <w:lang w:eastAsia="zh-TW"/>
+        </w:rPr>
+        <w:t>，後續</w:t>
+      </w:r>
+      <w:r>
+        <w:rPr>
+          <w:rFonts w:ascii="FangSong" w:eastAsia="FangSong" w:hAnsi="FangSong" w:hint="eastAsia"/>
+          <w:sz w:val="28"/>
+          <w:szCs w:val="28"/>
+          <w:lang w:eastAsia="zh-TW"/>
+        </w:rPr>
+        <w:t>研究打通</w:t>
+      </w:r>
+      <w:r>
+        <w:rPr>
+          <w:rFonts w:ascii="FangSong" w:eastAsia="FangSong" w:hAnsi="FangSong" w:hint="eastAsia"/>
+          <w:sz w:val="28"/>
+          <w:szCs w:val="28"/>
+          <w:lang w:eastAsia="zh-TW"/>
+        </w:rPr>
+        <w:t>企</w:t>
+      </w:r>
+      <w:r>
+        <w:rPr>
+          <w:rFonts w:ascii="FangSong" w:eastAsia="FangSong" w:hAnsi="FangSong"/>
+          <w:sz w:val="28"/>
+          <w:szCs w:val="28"/>
+          <w:lang w:eastAsia="zh-TW"/>
+        </w:rPr>
+        <w:t>業微信</w:t>
       </w:r>
       <w:r>
         <w:rPr>
@@ -940,7 +976,7 @@
           <w:szCs w:val="28"/>
           <w:lang w:eastAsia="zh-TW"/>
         </w:rPr>
-        <w:t>教師個資留在 CTM 服務器，並做脫敏處理（如以校內教師編號上傳）。</w:t>
+        <w:t>教師個資留在 CTM 服務器。</w:t>
       </w:r>
     </w:p>
     <w:p>

</xml_diff>